<commit_message>
Update over 1100 files with major content and format revisions for 2026-03-30 release
</commit_message>
<xml_diff>
--- a/eng/docx/62.content.docx
+++ b/eng/docx/62.content.docx
@@ -56247,7 +56247,7 @@
         <w:rPr>
           <w:lang w:val="en_US" w:bidi="en_US"/>
         </w:rPr>
-        <w:t>John is speaking of a real situation as if it were a hypothetical condition. If your language does not state something as a condition if it is already real, and if your readers might think that what John is saying is not real, then you could translate his words as an affirmative statement. Alternate translation: “But as we love each other, God remains in us, and his love is perfected in us” or “But we do love each other, so that means that God remains in us, and his love is perfected in us”</w:t>
+        <w:t>John is speaking of a real situation as if it were a hypothetical condition. If your language does not state something as a condition if it is already real, and if your readers might think that what John is saying is not real, then you could translate his statement without using “if.” Alternate translation: "But as we love each other, God remains in us, and his love is perfected in us" or "But by loving each other, we know that God remains in us, and his love is perfected in us"</w:t>
       </w:r>
     </w:p>
     <w:p>
@@ -65536,21 +65536,6 @@
           <w:b/>
           <w:lang w:val="en_US" w:bidi="en_US"/>
         </w:rPr>
-        <w:t>δι’ ὕδατος καὶ αἵματος</w:t>
-      </w:r>
-    </w:p>
-    <w:p>
-      <w:pPr/>
-      <w:r>
-        <w:rPr>
-          <w:lang w:val="en_US" w:bidi="en_US"/>
-        </w:rPr>
-      </w:r>
-      <w:r>
-        <w:rPr>
-          <w:b/>
-          <w:lang w:val="en_US" w:bidi="en_US"/>
-        </w:rPr>
         <w:t>"by water and blood"</w:t>
       </w:r>
     </w:p>
@@ -65578,7 +65563,7 @@
         <w:rPr>
           <w:lang w:val="en_US" w:bidi="en_US"/>
         </w:rPr>
-        <w:t xml:space="preserve"> conveying Jesus to us or Jesus coming to us through water and through blood. The meaning is that Jesus became our Savior as he experienced baptism in water and submitted himself to death on the cross. Alternate translation “as our Savior, undergoing baptism and death”</w:t>
+        <w:t xml:space="preserve"> conveying Jesus to us or Jesus coming to us through water and through blood. The meaning is either that: (1) Jesus became our Savior as he experienced baptism in water and submitted himself to death on the cross, Alternate translation: [as our Savior, undergoing baptism and death] or (2) Jesus became our Savior as he experienced human birth and submitted himself to death on the cross. Alternate translation: [as our Savior, undergoing human birth and death]</w:t>
       </w:r>
     </w:p>
     <w:p>
@@ -76386,7 +76371,7 @@
         <w:rPr>
           <w:lang w:val="en_US" w:bidi="en_US"/>
         </w:rPr>
-        <w:t xml:space="preserve">It is not entirely clear what John means by this phrase. The word “death” could refer either to physical death or to spiritual death, which is eternal separation from God. See the further discussion in the notes to </w:t>
+        <w:t xml:space="preserve">In the context, the word “death” in this phrase refers to spiritual death, which is eternal separation from God. But it is not entirely clear what the sin is that John is talking about. It is unlikely that John is referring to one sin in particular, but instead he is talking about a certain kind of sin. Given the context of this letter, he is probably referring to the kind of sin that the false teachers were committing by denying that Jesus was the Son of God and that he came in the flesh, and by rejecting his forgiveness. See the further discussion in the notes to </w:t>
       </w:r>
       <w:hyperlink r:id="rId95">
         <w:r>
@@ -76404,19 +76389,7 @@
         <w:rPr>
           <w:lang w:val="en_US" w:bidi="en_US"/>
         </w:rPr>
-        <w:t xml:space="preserve">. (See: </w:t>
-      </w:r>
-      <w:r>
-        <w:rPr>
-          <w:lang w:val="en_US" w:bidi="en_US"/>
-        </w:rPr>
-        <w:t>death</w:t>
-      </w:r>
-      <w:r>
-        <w:rPr>
-          <w:lang w:val="en_US" w:bidi="en_US"/>
-        </w:rPr>
-        <w:t>)</w:t>
+        <w:t>.</w:t>
       </w:r>
     </w:p>
     <w:p>

</xml_diff>